<commit_message>
fixed the open new tab and word file size
</commit_message>
<xml_diff>
--- a/docs/content/analysis_of_variance/11_04_how_anova_is_dummy_var_regression.docx
+++ b/docs/content/analysis_of_variance/11_04_how_anova_is_dummy_var_regression.docx
@@ -2801,7 +2801,7 @@
       <w:r>
         <w:drawing>
           <wp:inline>
-            <wp:extent cx="3200400" cy="3200400"/>
+            <wp:extent cx="3245476" cy="3245476"/>
             <wp:effectExtent b="0" l="0" r="0" t="0"/>
             <wp:docPr descr="" title="" id="12" name="Picture"/>
             <a:graphic>
@@ -2822,7 +2822,7 @@
                   <pic:spPr bwMode="auto">
                     <a:xfrm>
                       <a:off x="0" y="0"/>
-                      <a:ext cx="3200400" cy="3200400"/>
+                      <a:ext cx="3245476" cy="3245476"/>
                     </a:xfrm>
                     <a:prstGeom prst="rect">
                       <a:avLst/>
@@ -6369,7 +6369,7 @@
       <w:r>
         <w:drawing>
           <wp:inline>
-            <wp:extent cx="3200400" cy="3200400"/>
+            <wp:extent cx="3245476" cy="3245476"/>
             <wp:effectExtent b="0" l="0" r="0" t="0"/>
             <wp:docPr descr="" title="" id="18" name="Picture"/>
             <a:graphic>
@@ -6390,7 +6390,7 @@
                   <pic:spPr bwMode="auto">
                     <a:xfrm>
                       <a:off x="0" y="0"/>
-                      <a:ext cx="3200400" cy="3200400"/>
+                      <a:ext cx="3245476" cy="3245476"/>
                     </a:xfrm>
                     <a:prstGeom prst="rect">
                       <a:avLst/>
@@ -8234,7 +8234,7 @@
       <w:r>
         <w:drawing>
           <wp:inline>
-            <wp:extent cx="3200400" cy="3200400"/>
+            <wp:extent cx="3245476" cy="3245476"/>
             <wp:effectExtent b="0" l="0" r="0" t="0"/>
             <wp:docPr descr="" title="" id="22" name="Picture"/>
             <a:graphic>
@@ -8255,7 +8255,7 @@
                   <pic:spPr bwMode="auto">
                     <a:xfrm>
                       <a:off x="0" y="0"/>
-                      <a:ext cx="3200400" cy="3200400"/>
+                      <a:ext cx="3245476" cy="3245476"/>
                     </a:xfrm>
                     <a:prstGeom prst="rect">
                       <a:avLst/>

</xml_diff>